<commit_message>
fix: Make footnote and endnote styles default
</commit_message>
<xml_diff>
--- a/docx/templates/default.docx
+++ b/docx/templates/default.docx
@@ -12057,6 +12057,72 @@
         <w:shd w:val="clear" w:color="auto" w:fill="FBCAA2" w:themeFill="accent6" w:themeFillTint="7F"/>
       </w:tcPr>
     </w:tblStylePr>
+  </w:style>
+  <w:style w:type="paragraph" w:styleId="FootnoteText">
+    <w:name w:val="footnote text"/>
+    <w:basedOn w:val="Normal"/>
+    <w:link w:val="FootnoteTextChar"/>
+    <w:uiPriority w:val="99"/>
+    <w:semiHidden/>
+    <w:unhideWhenUsed/>
+    <w:rPr>
+      <w:sz w:val="20"/>
+      <w:szCs w:val="20"/>
+    </w:rPr>
+  </w:style>
+  <w:style w:type="character" w:customStyle="1" w:styleId="FootnoteTextChar">
+    <w:name w:val="Footnote Text Char"/>
+    <w:basedOn w:val="DefaultParagraphFont"/>
+    <w:link w:val="FootnoteText"/>
+    <w:uiPriority w:val="99"/>
+    <w:semiHidden/>
+    <w:rPr>
+      <w:sz w:val="20"/>
+      <w:szCs w:val="20"/>
+    </w:rPr>
+  </w:style>
+  <w:style w:type="character" w:styleId="FootnoteReference">
+    <w:name w:val="footnote reference"/>
+    <w:basedOn w:val="DefaultParagraphFont"/>
+    <w:uiPriority w:val="99"/>
+    <w:semiHidden/>
+    <w:unhideWhenUsed/>
+    <w:rPr>
+      <w:vertAlign w:val="superscript"/>
+    </w:rPr>
+  </w:style>
+  <w:style w:type="paragraph" w:styleId="EndnoteText">
+    <w:name w:val="endnote text"/>
+    <w:basedOn w:val="Normal"/>
+    <w:link w:val="EndnoteTextChar"/>
+    <w:uiPriority w:val="99"/>
+    <w:semiHidden/>
+    <w:unhideWhenUsed/>
+    <w:rPr>
+      <w:sz w:val="20"/>
+      <w:szCs w:val="20"/>
+    </w:rPr>
+  </w:style>
+  <w:style w:type="character" w:customStyle="1" w:styleId="EndnoteTextChar">
+    <w:name w:val="Endnote Text Char"/>
+    <w:basedOn w:val="DefaultParagraphFont"/>
+    <w:link w:val="EndnoteText"/>
+    <w:uiPriority w:val="99"/>
+    <w:semiHidden/>
+    <w:rPr>
+      <w:sz w:val="20"/>
+      <w:szCs w:val="20"/>
+    </w:rPr>
+  </w:style>
+  <w:style w:type="character" w:styleId="EndnoteReference">
+    <w:name w:val="endnote reference"/>
+    <w:basedOn w:val="DefaultParagraphFont"/>
+    <w:uiPriority w:val="99"/>
+    <w:semiHidden/>
+    <w:unhideWhenUsed/>
+    <w:rPr>
+      <w:vertAlign w:val="superscript"/>
+    </w:rPr>
   </w:style>
 </w:styles>
 </file>

</xml_diff>